<commit_message>
📄 DOCX firmado: TEST007 - 2/6/2026, 10:11:49 a.m.
</commit_message>
<xml_diff>
--- a/data/declaraciones/signed/TEST007.docx
+++ b/data/declaraciones/signed/TEST007.docx
@@ -4184,7 +4184,7 @@
         <w:rPr>
           <w:lang w:val="es-MX"/>
         </w:rPr>
-        <w:t xml:space="preserve">Razon social</w:t>
+        <w:t xml:space="preserve">social</w:t>
       </w:r>
       <w:proofErr w:type="spellStart"/>
       <w:r>
@@ -4230,7 +4230,7 @@
         <w:rPr>
           <w:lang w:val="es-MX"/>
         </w:rPr>
-        <w:t xml:space="preserve">Representante legal</w:t>
+        <w:t xml:space="preserve">repre</w:t>
       </w:r>
       <w:proofErr w:type="spellStart"/>
       <w:r>

</xml_diff>